<commit_message>
Lab 1: tighten requirement wording and fix pagination
Shorten the Description, Acceptance Criteria and Rationale of all seven
requirements while keeping every measurable threshold.

Remove the empty filler paragraphs after the requirements table, which had
left a blank page before the use-case diagram, and shrink the trailing
paragraph so it no longer spills onto a blank final page. 6 pages -> 4.
</commit_message>
<xml_diff>
--- a/Lab1/Lab-1.docx
+++ b/Lab1/Lab-1.docx
@@ -556,7 +556,7 @@
                 <w:sz w:val="16"/>
                 <w:szCs w:val="16"/>
               </w:rPr>
-              <w:t>The system shall calculate the required security deposit for each item from its tool category, enforce that category's maximum loan duration, and compute a late return fee for each day an item is held beyond its due date.</w:t>
+              <w:t>The system shall set each item's security deposit and maximum loan duration from its tool category, and charge a late fee for every day an item is held past its due date.</w:t>
             </w:r>
           </w:p>
         </w:tc>
@@ -599,65 +599,7 @@
                 <w:sz w:val="16"/>
                 <w:szCs w:val="16"/>
               </w:rPr>
-              <w:t>Pass: A Category</w:t>
-            </w:r>
-            <w:r>
-              <w:rPr>
-                <w:sz w:val="16"/>
-                <w:szCs w:val="16"/>
-              </w:rPr>
-              <w:t>-</w:t>
-            </w:r>
-            <w:r>
-              <w:rPr>
-                <w:sz w:val="16"/>
-                <w:szCs w:val="16"/>
-              </w:rPr>
-              <w:t>C item (deposit Rs.2000, max loan 3 days) holds R</w:t>
-            </w:r>
-            <w:r>
-              <w:rPr>
-                <w:sz w:val="16"/>
-                <w:szCs w:val="16"/>
-              </w:rPr>
-              <w:t xml:space="preserve">s. </w:t>
-            </w:r>
-            <w:r>
-              <w:rPr>
-                <w:sz w:val="16"/>
-                <w:szCs w:val="16"/>
-              </w:rPr>
-              <w:t>2000 at checkout and falls due in 3 days; a 2-day-late return is charged 2</w:t>
-            </w:r>
-            <w:r>
-              <w:rPr>
-                <w:sz w:val="16"/>
-                <w:szCs w:val="16"/>
-              </w:rPr>
-              <w:t>x</w:t>
-            </w:r>
-            <w:r>
-              <w:rPr>
-                <w:sz w:val="16"/>
-                <w:szCs w:val="16"/>
-              </w:rPr>
-              <w:t xml:space="preserve"> the category daily rate. </w:t>
-            </w:r>
-          </w:p>
-          <w:p>
-            <w:pPr>
-              <w:spacing w:after="20" w:line="240" w:lineRule="auto"/>
-              <w:rPr>
-                <w:sz w:val="16"/>
-                <w:szCs w:val="16"/>
-              </w:rPr>
-            </w:pPr>
-            <w:r>
-              <w:rPr>
-                <w:sz w:val="16"/>
-                <w:szCs w:val="16"/>
-              </w:rPr>
-              <w:t>Fail: A zero deposit is held, a loan exceeds the category maximum, or a late return yields no fee.</w:t>
+              <w:t>Pass: A Category-C item (Rs.2000 deposit, 3-day limit) holds Rs.2000 at checkout and charges 2 days' late fee on a 2-day-late return. Fail: No deposit held, a loan over the category limit, or a late return with no fee.</w:t>
             </w:r>
           </w:p>
         </w:tc>
@@ -678,7 +620,7 @@
                 <w:sz w:val="16"/>
                 <w:szCs w:val="16"/>
               </w:rPr>
-              <w:t>Deposits and duration caps are the library's only protection against loss of high-value equipment.</w:t>
+              <w:t>Deposits and duration caps are the library's only protection against loss.</w:t>
             </w:r>
           </w:p>
         </w:tc>
@@ -763,7 +705,7 @@
                 <w:sz w:val="16"/>
                 <w:szCs w:val="16"/>
               </w:rPr>
-              <w:t>The system shall allow a Community Member to search the equipment catalogue by category, keyword, or required date, and shall show for each result its status (Available / Reserved / On Loan / Under Repair) and the depot locker holding it.</w:t>
+              <w:t>The system shall let a member search the catalogue by category, keyword or date, showing each result's status (Available / Reserved / On Loan / Under Repair) and its depot locker.</w:t>
             </w:r>
           </w:p>
         </w:tc>
@@ -806,7 +748,7 @@
                 <w:sz w:val="16"/>
                 <w:szCs w:val="16"/>
               </w:rPr>
-              <w:t>Pass: A search for 'lawnmower' returns only lawnmowers, each tagged with a status and a locker ID, and an item checked out 5 seconds earlier already shows On Loan. Fail: A result shows no locker, or an item already on loan is listed Available.</w:t>
+              <w:t>Pass: A 'lawnmower' search returns only lawnmowers, each with a status and locker ID, and an item checked out 5 s earlier already shows On Loan. Fail: A result shows no locker, or an item on loan is listed Available.</w:t>
             </w:r>
           </w:p>
         </w:tc>
@@ -827,7 +769,7 @@
                 <w:sz w:val="16"/>
                 <w:szCs w:val="16"/>
               </w:rPr>
-              <w:t>Members travel to a physical depot to collect; a wrong status or locker ID sends them to the wrong place.</w:t>
+              <w:t>Members collect in person, so a wrong status or locker sends them to the wrong place.</w:t>
             </w:r>
           </w:p>
         </w:tc>
@@ -913,7 +855,7 @@
                 <w:sz w:val="16"/>
                 <w:szCs w:val="16"/>
               </w:rPr>
-              <w:t>The system shall allow a Community Member to reserve an available item for a pickup window of at most 24 hours, and shall release the reservation automatically if the item is not collected before that window closes.</w:t>
+              <w:t>The system shall let a member reserve an available item for a pickup window of at most 24 hours, and release the reservation automatically if the item is not collected in time.</w:t>
             </w:r>
           </w:p>
         </w:tc>
@@ -956,7 +898,7 @@
                 <w:sz w:val="16"/>
                 <w:szCs w:val="16"/>
               </w:rPr>
-              <w:t>Pass: A reservation marks the item Reserved and blocks other members from reserving it; an uncollected reservation returns to Available within 5 minutes of the window closing. Fail: Two members hold reservations on one item, or an expired reservation still blocks it an hour later.</w:t>
+              <w:t>Pass: A reservation marks the item Reserved and blocks other members; an uncollected one returns to Available within 5 minutes of the window closing. Fail: Two members hold one item, or an expired reservation still blocks it.</w:t>
             </w:r>
           </w:p>
         </w:tc>
@@ -977,7 +919,7 @@
                 <w:sz w:val="16"/>
                 <w:szCs w:val="16"/>
               </w:rPr>
-              <w:t>Holds prevent wasted trips, but holds that never expire make scarce tools look permanently unavailable.</w:t>
+              <w:t>Holds prevent wasted trips, but holds that never expire hide scarce tools.</w:t>
             </w:r>
           </w:p>
         </w:tc>
@@ -1062,7 +1004,7 @@
                 <w:sz w:val="16"/>
                 <w:szCs w:val="16"/>
               </w:rPr>
-              <w:t>The system shall verify, before confirming any checkout, that the Community Member has no overdue item and no unpaid damage or late fee, and shall block checkout of high-value equipment when either condition fails.</w:t>
+              <w:t>Before confirming any checkout the system shall verify that the member has no overdue item and no unpaid damage or late fee, and shall block high-value items if either check fails.</w:t>
             </w:r>
           </w:p>
         </w:tc>
@@ -1105,7 +1047,7 @@
                 <w:sz w:val="16"/>
                 <w:szCs w:val="16"/>
               </w:rPr>
-              <w:t>Pass: A member holding one overdue drill is refused a chainsaw and is shown the blocking reason. Fail: A member with overdue tools borrows additional high-value equipment.</w:t>
+              <w:t>Pass: A member holding one overdue drill is refused a chainsaw and shown the reason. Fail: A member with overdue tools borrows further high-value equipment.</w:t>
             </w:r>
           </w:p>
         </w:tc>
@@ -1126,7 +1068,7 @@
                 <w:sz w:val="16"/>
                 <w:szCs w:val="16"/>
               </w:rPr>
-              <w:t>Unenforced eligibility lets one member accumulate the inventory the rest of the neighbourhood is waiting on.</w:t>
+              <w:t>Unenforced eligibility lets one member hoard what the neighbourhood is waiting on.</w:t>
             </w:r>
           </w:p>
         </w:tc>
@@ -1211,7 +1153,7 @@
                 <w:sz w:val="16"/>
                 <w:szCs w:val="16"/>
               </w:rPr>
-              <w:t>The system shall record the condition of every returned item, allow the Library Custodian to log a damage assessment with severity and repair cost, deduct that cost and any late fee from the held deposit, and release the balance to the member.</w:t>
+              <w:t>The system shall record each item's condition on return, let the Library Custodian log a damage assessment with repair cost, deduct that cost and any late fee from the held deposit, and release the balance.</w:t>
             </w:r>
           </w:p>
         </w:tc>
@@ -1254,7 +1196,7 @@
                 <w:sz w:val="16"/>
                 <w:szCs w:val="16"/>
               </w:rPr>
-              <w:t>Pass: A return carrying Rs.500 damage and Rs.120 late fee against a Rs.2000 deposit releases Rs.1380 with an itemised breakdown. Fail: The deposit is released in full despite logged damage, or the deduction does not equal damage + late fee.</w:t>
+              <w:t>Pass: A return with Rs.500 damage and Rs.120 late fee against a Rs.2000 deposit releases Rs.1380 with an itemised breakdown. Fail: The deposit is released in full despite logged damage.</w:t>
             </w:r>
           </w:p>
         </w:tc>
@@ -1275,7 +1217,7 @@
                 <w:sz w:val="16"/>
                 <w:szCs w:val="16"/>
               </w:rPr>
-              <w:t>Deposit settlement is the step members dispute; an itemised, auditable breakdown is what makes the charge defensible.</w:t>
+              <w:t>Settlement is the step members dispute; an itemised breakdown makes the charge defensible.</w:t>
             </w:r>
           </w:p>
         </w:tc>
@@ -1369,21 +1311,7 @@
                 <w:sz w:val="16"/>
                 <w:szCs w:val="16"/>
               </w:rPr>
-              <w:t xml:space="preserve">The equipment inventory search shall return real-time physical availability across all neighbourhood depot lockers within 2 s at the 95th percentile while sustaining 200 concurrent member </w:t>
-            </w:r>
-            <w:r>
-              <w:rPr>
-                <w:sz w:val="16"/>
-                <w:szCs w:val="16"/>
-              </w:rPr>
-              <w:t>sessions and</w:t>
-            </w:r>
-            <w:r>
-              <w:rPr>
-                <w:sz w:val="16"/>
-                <w:szCs w:val="16"/>
-              </w:rPr>
-              <w:t xml:space="preserve"> shall expose locker contents only to authenticated members.</w:t>
+              <w:t>Inventory search shall return real-time availability across all depot lockers within 2 s at the 95th percentile under 200 concurrent sessions, and expose locker contents only to authenticated members.</w:t>
             </w:r>
           </w:p>
         </w:tc>
@@ -1426,7 +1354,7 @@
                 <w:sz w:val="16"/>
                 <w:szCs w:val="16"/>
               </w:rPr>
-              <w:t>Pass: A load test at 200 concurrent users records p95 search latency of at most 2 s, locker status no more than 10 s stale, and HTTP 401 for an unauthenticated locker request. Fail: p95 above 2 s, staler data, or unauthenticated access succeeds.</w:t>
+              <w:t>Pass: At 200 concurrent users, p95 search latency is at most 2 s, locker status at most 10 s stale, and an unauthenticated locker request returns HTTP 401. Fail: p95 above 2 s, staler data, or unauthenticated access succeeds.</w:t>
             </w:r>
           </w:p>
         </w:tc>
@@ -1447,7 +1375,7 @@
                 <w:sz w:val="16"/>
                 <w:szCs w:val="16"/>
               </w:rPr>
-              <w:t>Slow or stale availability sends members to empty lockers, and locker contents reveal where valuable tools physically sit.</w:t>
+              <w:t>Stale data sends members to empty lockers, and locker contents reveal where valuable tools sit.</w:t>
             </w:r>
           </w:p>
         </w:tc>
@@ -1532,7 +1460,7 @@
                 <w:sz w:val="16"/>
                 <w:szCs w:val="16"/>
               </w:rPr>
-              <w:t>The system shall process all deposit holds and fee charges through the external payment gateway using tokenised references, shall store no card data, and shall retain an immutable audit record of every hold, deduction and release for 12 months.</w:t>
+              <w:t>All deposit holds and fee charges shall be processed through the external payment gateway as tokenised references, with no card data stored and an immutable 12-month audit record of every hold, deduction and release.</w:t>
             </w:r>
           </w:p>
         </w:tc>
@@ -1575,7 +1503,7 @@
                 <w:sz w:val="16"/>
                 <w:szCs w:val="16"/>
               </w:rPr>
-              <w:t>Pass: A database scan after 100 transactions finds no card number or CVV, only gateway tokens, and every transaction has a timestamped audit entry the application cannot alter. Fail: Any card field is recoverable, or a deduction has no matching audit entry.</w:t>
+              <w:t>Pass: A scan after 100 transactions finds only gateway tokens and no card data, and every transaction has a timestamped audit entry the application cannot alter. Fail: Card data is recoverable, or a deduction has no matching audit entry.</w:t>
             </w:r>
           </w:p>
         </w:tc>
@@ -1596,7 +1524,7 @@
                 <w:sz w:val="16"/>
                 <w:szCs w:val="16"/>
               </w:rPr>
-              <w:t>Money moves between neighbours rather than through a merchant, so the library must be able to prove what it charged and cannot justify holding card data.</w:t>
+              <w:t>The library must be able to prove what it charged, and has no reason to store card data.</w:t>
             </w:r>
           </w:p>
         </w:tc>
@@ -1616,58 +1544,6 @@
         </w:tc>
       </w:tr>
     </w:tbl>
-    <w:p>
-      <w:pPr>
-        <w:rPr>
-          <w:b/>
-          <w:bCs/>
-          <w:sz w:val="28"/>
-          <w:szCs w:val="28"/>
-        </w:rPr>
-      </w:pPr>
-    </w:p>
-    <w:p>
-      <w:pPr>
-        <w:rPr>
-          <w:sz w:val="28"/>
-          <w:szCs w:val="28"/>
-        </w:rPr>
-      </w:pPr>
-      <w:r>
-        <w:rPr>
-          <w:sz w:val="28"/>
-          <w:szCs w:val="28"/>
-        </w:rPr>
-        <w:br/>
-      </w:r>
-    </w:p>
-    <w:p>
-      <w:pPr>
-        <w:rPr>
-          <w:sz w:val="28"/>
-          <w:szCs w:val="28"/>
-          <w:lang w:val="en-GB"/>
-        </w:rPr>
-      </w:pPr>
-    </w:p>
-    <w:p>
-      <w:pPr>
-        <w:rPr>
-          <w:sz w:val="28"/>
-          <w:szCs w:val="28"/>
-          <w:lang w:val="en-GB"/>
-        </w:rPr>
-      </w:pPr>
-    </w:p>
-    <w:p>
-      <w:pPr>
-        <w:spacing w:before="0" w:after="20" w:line="240" w:lineRule="auto"/>
-        <w:rPr>
-          <w:sz w:val="28"/>
-          <w:szCs w:val="28"/>
-        </w:rPr>
-      </w:pPr>
-    </w:p>
     <w:p>
       <w:pPr>
         <w:spacing w:before="0" w:after="20" w:line="240" w:lineRule="auto"/>
@@ -2626,8 +2502,8 @@
       <w:pPr>
         <w:spacing w:before="0" w:after="20" w:line="240" w:lineRule="auto"/>
         <w:rPr>
-          <w:sz w:val="28"/>
-          <w:szCs w:val="28"/>
+          <w:sz w:val="4"/>
+          <w:szCs w:val="4"/>
         </w:rPr>
       </w:pPr>
     </w:p>

</xml_diff>